<commit_message>
Verify live Jenkins pipeline and refresh lab report
</commit_message>
<xml_diff>
--- a/reports/Assanbek_Kazbek_DevOps_Lab_Report.docx
+++ b/reports/Assanbek_Kazbek_DevOps_Lab_Report.docx
@@ -65,7 +65,7 @@
         <w:jc w:val="center"/>
       </w:pPr>
       <w:r>
-        <w:t>Report date: 9 October 2026</w:t>
+        <w:t>Report date: 13 October 2026</w:t>
       </w:r>
     </w:p>
     <w:p>
@@ -294,7 +294,7 @@
     </w:p>
     <w:p>
       <w:r>
-        <w:t>The objective of this individual laboratory work is to implement and explain one connected DevOps workflow: Linux, Git, GitHub, Docker, Jenkins, testing and deployment of a small personalized application. The project uses a genuine Linux Docker environment for Linux-only commands. The GitHub repository is public. The Jenkins pipeline was actually executed and its console log records Finished: SUCCESS.</w:t>
+        <w:t>The objective of this individual laboratory work is to implement and explain one connected DevOps workflow: Linux, Git, GitHub, Docker, Jenkins, testing and deployment of a small personalized application. The project uses a genuine Linux Docker environment for Linux-only commands. The GitHub repository is public. On 13 October 2026, the authenticated local Jenkins controller built current main commit b56d47e and recorded Finished: SUCCESS.</w:t>
       </w:r>
     </w:p>
     <w:p>
@@ -714,12 +714,12 @@
     </w:p>
     <w:p>
       <w:r>
-        <w:t>Implementation and actual result: The preserved job XML uses the public repository URL, */main and Jenkinsfile. The successful console begins Started Assanbek_Kazbek_DevOps #2.</w:t>
+        <w:t>Implementation and actual result: A live authenticated Jenkins controller on 127.0.0.1:8082 contains Assanbek_Kazbek_DevOps. Its live SCM configuration uses the public URL, */main and Jenkinsfile, with no empty credentialsId element.</w:t>
       </w:r>
     </w:p>
     <w:p>
       <w:r>
-        <w:t>Evidence: jenkins/job-config.xml; evidence/jenkins/console_build_2.txt</w:t>
+        <w:t>Evidence: jenkins/job-config.xml; evidence/jenkins/job_api.json; evidence/jenkins/console_build_3_current_main.txt</w:t>
       </w:r>
     </w:p>
     <w:p>
@@ -738,12 +738,12 @@
     </w:p>
     <w:p>
       <w:r>
-        <w:t>Implementation and actual result: Jenkinsfile defines all five stages. The stages check out SCM, compile Python, run two unit tests, build the image, run the container and inspect output.</w:t>
+        <w:t>Implementation and actual result: Jenkinsfile defines all five stages. The live build compiled Python, ran three tests including HTTP endpoints, built the image, ran the container and verified its health endpoint.</w:t>
       </w:r>
     </w:p>
     <w:p>
       <w:r>
-        <w:t>Evidence: Jenkinsfile; evidence/jenkins/console_build_2.txt</w:t>
+        <w:t>Evidence: Jenkinsfile; evidence/jenkins/console_build_3_current_main.txt</w:t>
       </w:r>
     </w:p>
     <w:p>
@@ -762,12 +762,12 @@
     </w:p>
     <w:p>
       <w:r>
-        <w:t>Implementation and actual result: Build #2 fetched https://github.com/RealKazbek/assanbek-kazbek-devops.git, checked out e16e061, then executed all required stages.</w:t>
+        <w:t>Implementation and actual result: The current live build fetched the public repository, checked out b56d47ede92be4388865efa298ee8a41d23287ca from origin/main, then executed all required stages.</w:t>
       </w:r>
     </w:p>
     <w:p>
       <w:r>
-        <w:t>Evidence: jenkins/job-config.xml; evidence/jenkins/console_build_2.txt</w:t>
+        <w:t>Evidence: evidence/jenkins/console_build_3_current_main.txt; evidence/jenkins/build_3_api.json</w:t>
       </w:r>
     </w:p>
     <w:p>
@@ -786,12 +786,12 @@
     </w:p>
     <w:p>
       <w:r>
-        <w:t>Implementation and actual result: The Jenkins environment block contains the four values. Console output contains Student: Kazbek Assanbek, Group: IT2-2302 and Student ID: 37765.</w:t>
+        <w:t>Implementation and actual result: The Jenkins environment block contains all four values. The current console prints Student: Kazbek Assanbek, Group: IT2-2302 and Student ID: 37765.</w:t>
       </w:r>
     </w:p>
     <w:p>
       <w:r>
-        <w:t>Evidence: Jenkinsfile; evidence/jenkins/console_build_2.txt</w:t>
+        <w:t>Evidence: Jenkinsfile; evidence/jenkins/console_build_3_current_main.txt</w:t>
       </w:r>
     </w:p>
     <w:p>
@@ -810,12 +810,12 @@
     </w:p>
     <w:p>
       <w:r>
-        <w:t>Implementation and actual result: Build #2 executed all five stages and ended Finished: SUCCESS. It built assanbek-kazbek-devops:jenkins, ran assanbek-kazbek-jenkins-app and checked out e16e061. Text/API evidence is genuine; required visual Jenkins screenshots were not captured under the command-line-only constraint.</w:t>
+        <w:t>Implementation and actual result: Live Jenkins build #2 executed Checkout, Build, Test, Docker Build and Docker Run and ended Finished: SUCCESS on b56d47e. Its API confirms result SUCCESS and origin/main SHA. Browser screenshots remain BLOCKED because an available browser-control surface was not provided; no images were fabricated.</w:t>
       </w:r>
     </w:p>
     <w:p>
       <w:r>
-        <w:t>Evidence: evidence/jenkins/console_build_2.txt; evidence/jenkins/console_build_2_api.txt; evidence/jenkins/controller_and_docker_verification.txt; evidence/SCREENSHOT_CAPTURE_STATUS.md</w:t>
+        <w:t>Evidence: evidence/jenkins/console_build_3_current_main.txt; evidence/jenkins/build_3_api.json; evidence/jenkins/job_api.json; evidence/jenkins/controller_and_docker_verification.txt; evidence/SCREENSHOT_CAPTURE_STATUS.md</w:t>
       </w:r>
     </w:p>
     <w:p>
@@ -942,7 +942,7 @@
         <w:pStyle w:val="CodeEvidence"/>
       </w:pPr>
       <w:r>
-        <w:t>* f50498d (HEAD -&gt; main, origin/main) Verify successful Jenkins pipeline and update final evidence</w:t>
+        <w:t>* b56d47e (HEAD -&gt; main, origin/main) Add HTTP health verification and test coverage</w:t>
         <w:br/>
         <w:t>*   e5b03c7 Merge development documentation updates</w:t>
         <w:br/>
@@ -965,7 +965,7 @@
         <w:pStyle w:val="CodeEvidence"/>
       </w:pPr>
       <w:r>
-        <w:t>Checking out Revision e16e0613786fe1df391589a7f283d7f5af0c9bb1</w:t>
+        <w:t>Checking out Revision b56d47ede92be4388865efa298ee8a41d23287ca</w:t>
         <w:br/>
         <w:t>[Pipeline] { (Checkout)</w:t>
         <w:br/>
@@ -997,12 +997,12 @@
     </w:p>
     <w:p>
       <w:r>
-        <w:t>The assignment asks for visual demonstration of GitHub and Jenkins screens. No browser, desktop, mouse or keyboard control was permitted while this report was prepared, so no genuine screenshots could be captured. No mockups or generated images are included. The exact blocked list and safe manual capture instructions are in evidence/SCREENSHOT_CAPTURE_STATUS.md.</w:t>
+        <w:t>The assignment asks for visual demonstration of GitHub and Jenkins screens. Browser-control was unavailable while this report was prepared, so no genuine screenshots could be captured. No mockups or generated images are included. The exact blocked list and safe manual capture instructions are in evidence/SCREENSHOT_CAPTURE_STATUS.md.</w:t>
       </w:r>
     </w:p>
     <w:p>
       <w:r>
-        <w:t>Existing genuine evidence for the successful Jenkins build is textual: evidence/jenkins/console_build_2.txt and evidence/jenkins/console_build_2_api.txt show the five stages, checked-out commit e16e061 and Finished: SUCCESS. The current GitHub main commit is f50498d; it was created after the successful build to retain verification material. This difference is documented and does not by itself invalidate the build.</w:t>
+        <w:t>Existing genuine evidence for the current successful Jenkins build is textual/API-based: evidence/jenkins/console_build_3_current_main.txt and evidence/jenkins/build_3_api.json show all five stages, checked-out commit b56d47e and Finished: SUCCESS. This SHA was the published GitHub main branch at the time of build.</w:t>
       </w:r>
     </w:p>
     <w:p>

</xml_diff>

<commit_message>
Add authentic browser evidence and Russian video script
</commit_message>
<xml_diff>
--- a/reports/Assanbek_Kazbek_DevOps_Lab_Report.docx
+++ b/reports/Assanbek_Kazbek_DevOps_Lab_Report.docx
@@ -294,7 +294,7 @@
     </w:p>
     <w:p>
       <w:r>
-        <w:t>The objective of this individual laboratory work is to implement and explain one connected DevOps workflow: Linux, Git, GitHub, Docker, Jenkins, testing and deployment of a small personalized application. The project uses a genuine Linux Docker environment for Linux-only commands. The GitHub repository is public. On 13 October 2026, the authenticated local Jenkins controller built current main commit b56d47e and recorded Finished: SUCCESS.</w:t>
+        <w:t>The objective of this individual laboratory work is to implement and explain one connected DevOps workflow: Linux, Git, GitHub, Docker, Jenkins, testing and deployment of a small personalized application. The project uses a genuine Linux Docker environment for Linux-only commands. The GitHub repository is public. On 13 October 2026, the authenticated local Jenkins controller built final main commit b1019ec and recorded Finished: SUCCESS.</w:t>
       </w:r>
     </w:p>
     <w:p>
@@ -762,12 +762,12 @@
     </w:p>
     <w:p>
       <w:r>
-        <w:t>Implementation and actual result: The current live build fetched the public repository, checked out b56d47ede92be4388865efa298ee8a41d23287ca from origin/main, then executed all required stages.</w:t>
+        <w:t>Implementation and actual result: The final live build fetched the public repository, checked out b1019ec33635ad334e47a391124908b8002823ee from origin/main, then executed all required stages.</w:t>
       </w:r>
     </w:p>
     <w:p>
       <w:r>
-        <w:t>Evidence: evidence/jenkins/console_build_3_current_main.txt; evidence/jenkins/build_3_api.json</w:t>
+        <w:t>Evidence: evidence/jenkins/console_build_4_final_main.txt; evidence/jenkins/build_4_final_api.json</w:t>
       </w:r>
     </w:p>
     <w:p>
@@ -810,12 +810,12 @@
     </w:p>
     <w:p>
       <w:r>
-        <w:t>Implementation and actual result: Live Jenkins build #2 executed Checkout, Build, Test, Docker Build and Docker Run and ended Finished: SUCCESS on b56d47e. Its API confirms result SUCCESS and origin/main SHA. Browser screenshots remain BLOCKED because an available browser-control surface was not provided; no images were fabricated.</w:t>
+        <w:t>Implementation and actual result: Final Jenkins build #3 executed Checkout, Build, Test, Docker Build and Docker Run and ended Finished: SUCCESS on b1019ec. Its API confirms result SUCCESS and origin/main SHA. Browser screenshots remain BLOCKED because an available browser-control surface was not provided; no images were fabricated.</w:t>
       </w:r>
     </w:p>
     <w:p>
       <w:r>
-        <w:t>Evidence: evidence/jenkins/console_build_3_current_main.txt; evidence/jenkins/build_3_api.json; evidence/jenkins/job_api.json; evidence/jenkins/controller_and_docker_verification.txt; evidence/SCREENSHOT_CAPTURE_STATUS.md</w:t>
+        <w:t>Evidence: evidence/jenkins/console_build_4_final_main.txt; evidence/jenkins/build_4_final_api.json; evidence/jenkins/job_api.json; evidence/jenkins/controller_and_docker_verification.txt; evidence/SCREENSHOT_CAPTURE_STATUS.md</w:t>
       </w:r>
     </w:p>
     <w:p>
@@ -942,7 +942,7 @@
         <w:pStyle w:val="CodeEvidence"/>
       </w:pPr>
       <w:r>
-        <w:t>* b56d47e (HEAD -&gt; main, origin/main) Add HTTP health verification and test coverage</w:t>
+        <w:t>* b1019ec (HEAD -&gt; main, origin/main) Verify live Jenkins pipeline and refresh lab report</w:t>
         <w:br/>
         <w:t>*   e5b03c7 Merge development documentation updates</w:t>
         <w:br/>
@@ -965,7 +965,7 @@
         <w:pStyle w:val="CodeEvidence"/>
       </w:pPr>
       <w:r>
-        <w:t>Checking out Revision b56d47ede92be4388865efa298ee8a41d23287ca</w:t>
+        <w:t>Checking out Revision b1019ec33635ad334e47a391124908b8002823ee</w:t>
         <w:br/>
         <w:t>[Pipeline] { (Checkout)</w:t>
         <w:br/>
@@ -1002,7 +1002,7 @@
     </w:p>
     <w:p>
       <w:r>
-        <w:t>Existing genuine evidence for the current successful Jenkins build is textual/API-based: evidence/jenkins/console_build_3_current_main.txt and evidence/jenkins/build_3_api.json show all five stages, checked-out commit b56d47e and Finished: SUCCESS. This SHA was the published GitHub main branch at the time of build.</w:t>
+        <w:t>Existing genuine evidence for the final successful Jenkins build is textual/API-based: evidence/jenkins/console_build_4_final_main.txt and evidence/jenkins/build_4_final_api.json show all five stages, checked-out commit b1019ec and Finished: SUCCESS. This SHA was the published GitHub main branch at the time of build.</w:t>
       </w:r>
     </w:p>
     <w:p>

</xml_diff>